<commit_message>
BF6 örnek içeriği inceleme düzeltmeleriyle güncellendi
Co-Authored-By: Claude Opus 5.5 <noreply@anthropic.com>
</commit_message>
<xml_diff>
--- a/examples/ornek-icerik-battlefield-6.docx
+++ b/examples/ornek-icerik-battlefield-6.docx
@@ -270,7 +270,7 @@
           <w:color w:val="10332F"/>
           <w:sz w:val="21"/>
         </w:rPr>
-        <w:t xml:space="preserve">Doğrusal hikâye modu, Battlefield 4'ten sonra ilk kez Battlefield 6 ile seriye geri döndü. Hikâye 2027-2028 yıllarında, </w:t>
+        <w:t xml:space="preserve">Battlefield 2042'de yer almayan doğrusal hikâye modu, Battlefield 6 ile seriye geri döndü. Hikâye 2027-2028 yıllarında, </w:t>
       </w:r>
       <w:r>
         <w:rPr>
@@ -330,7 +330,7 @@
           <w:color w:val="10332F"/>
           <w:sz w:val="21"/>
         </w:rPr>
-        <w:t xml:space="preserve">Bu tercih bilinçli. Geliştirici ekip hikâyenin tonu için, sıradan insanların olağanüstü durumlara düştüğü anlatıları referans aldığını belirtmiştir; bölümler de kahramanlık gösterisinden çok sahadaki kargaşayı anlatır. Süre tarafında ise HowLongToBeat verilerine göre ana hikâyeyi bitirmek </w:t>
+        <w:t xml:space="preserve">Bu tercih bilinçli. Geliştirici ekip hikâyenin tonu için, yetenekli ama sıradan insanların olağanüstü durumlara düştüğü Lioness ve Civil War gibi yapımları referans aldığını belirtmiştir; bölümler de kahramanlık gösterisinden çok sahadaki kargaşayı anlatır. Süre tarafında ise HowLongToBeat verilerine göre ana hikâyeyi bitirmek </w:t>
       </w:r>
       <w:r>
         <w:rPr>
@@ -910,7 +910,7 @@
           <w:color w:val="10332F"/>
           <w:sz w:val="21"/>
         </w:rPr>
-        <w:t xml:space="preserve"> bestelemiştir. Şarkı seçkisi ise </w:t>
+        <w:t xml:space="preserve"> bestelemiştir. Oyunun şarkılarını ise </w:t>
       </w:r>
       <w:r>
         <w:rPr>
@@ -927,7 +927,7 @@
           <w:color w:val="10332F"/>
           <w:sz w:val="21"/>
         </w:rPr>
-        <w:t xml:space="preserve"> imzası taşımaktadır; grubun oyun için hazırladığı tekli, çıkıştan yaklaşık bir ay önce, 12 Eylül 2025'te yayımlanmıştır.</w:t>
+        <w:t xml:space="preserve"> hazırlamıştır.</w:t>
       </w:r>
     </w:p>
     <w:p>
@@ -1053,7 +1053,7 @@
           <w:color w:val="10332F"/>
           <w:sz w:val="21"/>
         </w:rPr>
-        <w:t>Battlefield 4'ten sonra seriye dönen tek oyunculu hikâye modu</w:t>
+        <w:t>Battlefield 2042'de bulunmayan tek oyunculu hikâye modunun geri dönüşü</w:t>
       </w:r>
     </w:p>
     <w:p>
@@ -2486,7 +2486,7 @@
           <w:color w:val="10332F"/>
           <w:sz w:val="21"/>
         </w:rPr>
-        <w:t>Hayır. Battlefield 6'nın PC sürümü kalıcı internet bağlantısı ve EA hesabı ister; GeForce NOW'da da oyun bulutta çalıştığı için bağlantının kesintisiz olması gerekir. GAME+, 1080p ve 60 FPS için 25 Mbps, 4K ve 120 FPS için 45 Mbps hız önerir.</w:t>
+        <w:t>Hayır. Battlefield 6'nın PC sürümü kalıcı internet bağlantısı ve EA hesabı ister; GeForce NOW'da da oyun bulutta çalıştığı için bağlantının kesintisiz olması gerekir. GeForce NOW için 1080p ve 60 FPS'te 25 Mbps, 4K ve 120 FPS'te 45 Mbps hız önerilir.</w:t>
       </w:r>
     </w:p>
     <w:p>

</xml_diff>